<commit_message>
Project Timeline (Gantt Chart)
semester 1
</commit_message>
<xml_diff>
--- a/Capstone Project Proposal_CA1.docx
+++ b/Capstone Project Proposal_CA1.docx
@@ -39,6 +39,49 @@
           <w:rFonts w:ascii="Times New Roman" w:hAnsi="Times New Roman" w:cs="Times New Roman"/>
           <w:b/>
           <w:bCs/>
+          <w:sz w:val="32"/>
+          <w:szCs w:val="32"/>
+        </w:rPr>
+      </w:pPr>
+      <w:r>
+        <w:rPr>
+          <w:rFonts w:ascii="Times New Roman" w:hAnsi="Times New Roman" w:cs="Times New Roman"/>
+          <w:b/>
+          <w:bCs/>
+          <w:sz w:val="32"/>
+          <w:szCs w:val="32"/>
+        </w:rPr>
+        <w:t xml:space="preserve">Predictive </w:t>
+      </w:r>
+      <w:proofErr w:type="spellStart"/>
+      <w:r>
+        <w:rPr>
+          <w:rFonts w:ascii="Times New Roman" w:hAnsi="Times New Roman" w:cs="Times New Roman"/>
+          <w:b/>
+          <w:bCs/>
+          <w:sz w:val="32"/>
+          <w:szCs w:val="32"/>
+        </w:rPr>
+        <w:t>Modeling</w:t>
+      </w:r>
+      <w:proofErr w:type="spellEnd"/>
+      <w:r>
+        <w:rPr>
+          <w:rFonts w:ascii="Times New Roman" w:hAnsi="Times New Roman" w:cs="Times New Roman"/>
+          <w:b/>
+          <w:bCs/>
+          <w:sz w:val="32"/>
+          <w:szCs w:val="32"/>
+        </w:rPr>
+        <w:t xml:space="preserve"> for Card Payment Fraud Detection in the Irish Banking Sector Using Central Bank of Ireland Data</w:t>
+      </w:r>
+    </w:p>
+    <w:p>
+      <w:pPr>
+        <w:rPr>
+          <w:rFonts w:ascii="Times New Roman" w:hAnsi="Times New Roman" w:cs="Times New Roman"/>
+          <w:b/>
+          <w:bCs/>
           <w:sz w:val="24"/>
           <w:szCs w:val="24"/>
         </w:rPr>
@@ -51,10 +94,112 @@
           <w:sz w:val="24"/>
           <w:szCs w:val="24"/>
         </w:rPr>
-        <w:t xml:space="preserve">Predictive </w:t>
+        <w:t>1. Introduction</w:t>
+      </w:r>
+    </w:p>
+    <w:p>
+      <w:pPr>
+        <w:rPr>
+          <w:rFonts w:ascii="Times New Roman" w:hAnsi="Times New Roman" w:cs="Times New Roman"/>
+        </w:rPr>
+      </w:pPr>
+      <w:r>
+        <w:rPr>
+          <w:rFonts w:ascii="Times New Roman" w:hAnsi="Times New Roman" w:cs="Times New Roman"/>
+        </w:rPr>
+        <w:t xml:space="preserve">Card payment fraud has become one of the most significant operational and financial risks facing Irish banks. As digital payments continue to expand, fraudsters increasingly exploit online channels, social engineering, and </w:t>
+      </w:r>
+      <w:r>
+        <w:rPr>
+          <w:rFonts w:ascii="Times New Roman" w:hAnsi="Times New Roman" w:cs="Times New Roman"/>
+        </w:rPr>
+        <w:t>cross-border</w:t>
+      </w:r>
+      <w:r>
+        <w:rPr>
+          <w:rFonts w:ascii="Times New Roman" w:hAnsi="Times New Roman" w:cs="Times New Roman"/>
+        </w:rPr>
+        <w:t xml:space="preserve"> vulnerabilities. According to the Central Bank of Ireland, fraudulent payment transactions reached €179.04 million in 2025, representing a 27.2% increase from 2024 (Central Bank of Ireland, 2025). Card payment fraud alone accounted for €51.01 million, an 18.6% rise compared to the previous year (Central Bank of Ireland, 2025). Notably, 89% of card payment fraud occurred through online channels, highlighting </w:t>
+      </w:r>
+      <w:r>
+        <w:rPr>
+          <w:rFonts w:ascii="Times New Roman" w:hAnsi="Times New Roman" w:cs="Times New Roman"/>
+        </w:rPr>
+        <w:t xml:space="preserve">Irish consumers' growing exposure </w:t>
+      </w:r>
+      <w:r>
+        <w:rPr>
+          <w:rFonts w:ascii="Times New Roman" w:hAnsi="Times New Roman" w:cs="Times New Roman"/>
+        </w:rPr>
+        <w:t>to digital fraud (Central Bank of Ireland, 2025).</w:t>
+      </w:r>
+    </w:p>
+    <w:p>
+      <w:pPr>
+        <w:rPr>
+          <w:rFonts w:ascii="Times New Roman" w:hAnsi="Times New Roman" w:cs="Times New Roman"/>
+        </w:rPr>
+      </w:pPr>
+      <w:r>
+        <w:rPr>
+          <w:rFonts w:ascii="Times New Roman" w:hAnsi="Times New Roman" w:cs="Times New Roman"/>
+        </w:rPr>
+        <w:t xml:space="preserve">This trend presents a strategic challenge for Irish banks. Fraud losses reduce profitability, damage customer trust, and increase regulatory pressure under frameworks such as PSD2 (Second Payment Services Directive) and Strong Customer Authentication (European Banking Authority, 2022). Traditional </w:t>
+      </w:r>
+      <w:r>
+        <w:rPr>
+          <w:rFonts w:ascii="Times New Roman" w:hAnsi="Times New Roman" w:cs="Times New Roman"/>
+        </w:rPr>
+        <w:t>rule-based</w:t>
+      </w:r>
+      <w:r>
+        <w:rPr>
+          <w:rFonts w:ascii="Times New Roman" w:hAnsi="Times New Roman" w:cs="Times New Roman"/>
+        </w:rPr>
+        <w:t xml:space="preserve"> fraud detection systems are reactive and struggle to identify emerging fraud patterns (Bhattacharyya et al., 2011). As fraud becomes more sophisticated, predictive analytics offers a more effective approach to identifying suspicious behaviour and forecasting future fraud risks.</w:t>
+      </w:r>
+    </w:p>
+    <w:p>
+      <w:pPr>
+        <w:rPr>
+          <w:rFonts w:ascii="Times New Roman" w:hAnsi="Times New Roman" w:cs="Times New Roman"/>
+        </w:rPr>
+      </w:pPr>
+      <w:r>
+        <w:rPr>
+          <w:rFonts w:ascii="Times New Roman" w:hAnsi="Times New Roman" w:cs="Times New Roman"/>
+        </w:rPr>
+        <w:t xml:space="preserve">This project proposes a predictive </w:t>
       </w:r>
       <w:proofErr w:type="spellStart"/>
       <w:r>
+        <w:rPr>
+          <w:rFonts w:ascii="Times New Roman" w:hAnsi="Times New Roman" w:cs="Times New Roman"/>
+        </w:rPr>
+        <w:t>modeling</w:t>
+      </w:r>
+      <w:proofErr w:type="spellEnd"/>
+      <w:r>
+        <w:rPr>
+          <w:rFonts w:ascii="Times New Roman" w:hAnsi="Times New Roman" w:cs="Times New Roman"/>
+        </w:rPr>
+        <w:t xml:space="preserve"> solution using the Central Bank of Ireland’s Card Payments Fraud datasets (2022–2025). The project will analyse fraud trends, identify behavioural patterns, develop classification and forecasting models, and produce a fraud risk scoring system to support strategic fraud prevention </w:t>
+      </w:r>
+      <w:r>
+        <w:rPr>
+          <w:rFonts w:ascii="Times New Roman" w:hAnsi="Times New Roman" w:cs="Times New Roman"/>
+        </w:rPr>
+        <w:t>decision-making</w:t>
+      </w:r>
+      <w:r>
+        <w:rPr>
+          <w:rFonts w:ascii="Times New Roman" w:hAnsi="Times New Roman" w:cs="Times New Roman"/>
+        </w:rPr>
+        <w:t xml:space="preserve"> in the Irish banking sector.</w:t>
+      </w:r>
+    </w:p>
+    <w:p>
+      <w:pPr>
         <w:rPr>
           <w:rFonts w:ascii="Times New Roman" w:hAnsi="Times New Roman" w:cs="Times New Roman"/>
           <w:b/>
@@ -62,9 +207,7 @@
           <w:sz w:val="24"/>
           <w:szCs w:val="24"/>
         </w:rPr>
-        <w:t>Modeling</w:t>
-      </w:r>
-      <w:proofErr w:type="spellEnd"/>
+      </w:pPr>
       <w:r>
         <w:rPr>
           <w:rFonts w:ascii="Times New Roman" w:hAnsi="Times New Roman" w:cs="Times New Roman"/>
@@ -73,137 +216,6 @@
           <w:sz w:val="24"/>
           <w:szCs w:val="24"/>
         </w:rPr>
-        <w:t xml:space="preserve"> for Card Payment Fraud Detection in the Irish Banking Sector Using Central Bank of Ireland Data</w:t>
-      </w:r>
-    </w:p>
-    <w:p>
-      <w:pPr>
-        <w:rPr>
-          <w:rFonts w:ascii="Times New Roman" w:hAnsi="Times New Roman" w:cs="Times New Roman"/>
-          <w:b/>
-          <w:bCs/>
-          <w:sz w:val="24"/>
-          <w:szCs w:val="24"/>
-        </w:rPr>
-      </w:pPr>
-      <w:r>
-        <w:rPr>
-          <w:rFonts w:ascii="Times New Roman" w:hAnsi="Times New Roman" w:cs="Times New Roman"/>
-          <w:b/>
-          <w:bCs/>
-          <w:sz w:val="24"/>
-          <w:szCs w:val="24"/>
-        </w:rPr>
-        <w:t>1. Introduction</w:t>
-      </w:r>
-    </w:p>
-    <w:p>
-      <w:pPr>
-        <w:rPr>
-          <w:rFonts w:ascii="Times New Roman" w:hAnsi="Times New Roman" w:cs="Times New Roman"/>
-        </w:rPr>
-      </w:pPr>
-      <w:r>
-        <w:rPr>
-          <w:rFonts w:ascii="Times New Roman" w:hAnsi="Times New Roman" w:cs="Times New Roman"/>
-        </w:rPr>
-        <w:t xml:space="preserve">Card payment fraud has become one of the most significant operational and financial risks facing Irish banks. As digital payments continue to expand, fraudsters increasingly exploit online channels, social engineering, and </w:t>
-      </w:r>
-      <w:r>
-        <w:rPr>
-          <w:rFonts w:ascii="Times New Roman" w:hAnsi="Times New Roman" w:cs="Times New Roman"/>
-        </w:rPr>
-        <w:t>cross-border</w:t>
-      </w:r>
-      <w:r>
-        <w:rPr>
-          <w:rFonts w:ascii="Times New Roman" w:hAnsi="Times New Roman" w:cs="Times New Roman"/>
-        </w:rPr>
-        <w:t xml:space="preserve"> vulnerabilities. According to the Central Bank of Ireland, fraudulent payment transactions reached €179.04 million in 2025, representing a 27.2% increase from 2024 (Central Bank of Ireland, 2025). Card payment fraud alone accounted for €51.01 million, an 18.6% rise compared to the previous year (Central Bank of Ireland, 2025). Notably, 89% of card payment fraud occurred through online channels, highlighting the growing exposure of Irish consumers to digital fraud (Central Bank of Ireland, 2025).</w:t>
-      </w:r>
-    </w:p>
-    <w:p>
-      <w:pPr>
-        <w:rPr>
-          <w:rFonts w:ascii="Times New Roman" w:hAnsi="Times New Roman" w:cs="Times New Roman"/>
-        </w:rPr>
-      </w:pPr>
-      <w:r>
-        <w:rPr>
-          <w:rFonts w:ascii="Times New Roman" w:hAnsi="Times New Roman" w:cs="Times New Roman"/>
-        </w:rPr>
-        <w:t xml:space="preserve">This trend presents a strategic challenge for Irish banks. Fraud losses reduce profitability, damage customer trust, and increase regulatory pressure under frameworks such as PSD2 (Second Payment Services Directive) and Strong Customer Authentication (European Banking Authority, 2022). Traditional </w:t>
-      </w:r>
-      <w:r>
-        <w:rPr>
-          <w:rFonts w:ascii="Times New Roman" w:hAnsi="Times New Roman" w:cs="Times New Roman"/>
-        </w:rPr>
-        <w:t>rule-based</w:t>
-      </w:r>
-      <w:r>
-        <w:rPr>
-          <w:rFonts w:ascii="Times New Roman" w:hAnsi="Times New Roman" w:cs="Times New Roman"/>
-        </w:rPr>
-        <w:t xml:space="preserve"> fraud detection systems are reactive and struggle to identify emerging fraud patterns (Bhattacharyya et al., 2011). As fraud becomes more sophisticated, predictive analytics offers a more effective approach to identifying suspicious behaviour and forecasting future fraud risks.</w:t>
-      </w:r>
-    </w:p>
-    <w:p>
-      <w:pPr>
-        <w:rPr>
-          <w:rFonts w:ascii="Times New Roman" w:hAnsi="Times New Roman" w:cs="Times New Roman"/>
-        </w:rPr>
-      </w:pPr>
-      <w:r>
-        <w:rPr>
-          <w:rFonts w:ascii="Times New Roman" w:hAnsi="Times New Roman" w:cs="Times New Roman"/>
-        </w:rPr>
-        <w:t xml:space="preserve">This project proposes a predictive </w:t>
-      </w:r>
-      <w:proofErr w:type="spellStart"/>
-      <w:r>
-        <w:rPr>
-          <w:rFonts w:ascii="Times New Roman" w:hAnsi="Times New Roman" w:cs="Times New Roman"/>
-        </w:rPr>
-        <w:t>modeling</w:t>
-      </w:r>
-      <w:proofErr w:type="spellEnd"/>
-      <w:r>
-        <w:rPr>
-          <w:rFonts w:ascii="Times New Roman" w:hAnsi="Times New Roman" w:cs="Times New Roman"/>
-        </w:rPr>
-        <w:t xml:space="preserve"> solution using the Central Bank of Ireland’s Card Payments Fraud datasets (2022–2025). The project will analyse fraud trends, identify behavioural patterns, develop classification and forecasting models, and produce a fraud risk scoring system to support strategic fraud prevention </w:t>
-      </w:r>
-      <w:r>
-        <w:rPr>
-          <w:rFonts w:ascii="Times New Roman" w:hAnsi="Times New Roman" w:cs="Times New Roman"/>
-        </w:rPr>
-        <w:t>decision-making</w:t>
-      </w:r>
-      <w:r>
-        <w:rPr>
-          <w:rFonts w:ascii="Times New Roman" w:hAnsi="Times New Roman" w:cs="Times New Roman"/>
-        </w:rPr>
-        <w:t xml:space="preserve"> in the Irish banking sector.</w:t>
-      </w:r>
-    </w:p>
-    <w:p>
-      <w:pPr>
-        <w:rPr>
-          <w:rFonts w:ascii="Times New Roman" w:hAnsi="Times New Roman" w:cs="Times New Roman"/>
-          <w:b/>
-          <w:bCs/>
-          <w:sz w:val="24"/>
-          <w:szCs w:val="24"/>
-        </w:rPr>
-      </w:pPr>
-      <w:r>
-        <w:rPr>
-          <w:rFonts w:ascii="Times New Roman" w:hAnsi="Times New Roman" w:cs="Times New Roman"/>
-          <w:b/>
-          <w:bCs/>
-          <w:sz w:val="24"/>
-          <w:szCs w:val="24"/>
-        </w:rPr>
         <w:t>2. Problem Definition</w:t>
       </w:r>
     </w:p>
@@ -223,13 +235,19 @@
         <w:rPr>
           <w:rFonts w:ascii="Times New Roman" w:hAnsi="Times New Roman" w:cs="Times New Roman"/>
         </w:rPr>
-        <w:t>harder to detect with</w:t>
-      </w:r>
-      <w:r>
-        <w:rPr>
-          <w:rFonts w:ascii="Times New Roman" w:hAnsi="Times New Roman" w:cs="Times New Roman"/>
-        </w:rPr>
-        <w:t xml:space="preserve"> traditional systems.</w:t>
+        <w:t xml:space="preserve">harder </w:t>
+      </w:r>
+      <w:r>
+        <w:rPr>
+          <w:rFonts w:ascii="Times New Roman" w:hAnsi="Times New Roman" w:cs="Times New Roman"/>
+        </w:rPr>
+        <w:t>for traditional systems to detect</w:t>
+      </w:r>
+      <w:r>
+        <w:rPr>
+          <w:rFonts w:ascii="Times New Roman" w:hAnsi="Times New Roman" w:cs="Times New Roman"/>
+        </w:rPr>
+        <w:t>.</w:t>
       </w:r>
     </w:p>
     <w:p>
@@ -542,17 +560,6 @@
           <w:szCs w:val="24"/>
         </w:rPr>
       </w:pPr>
-    </w:p>
-    <w:p>
-      <w:pPr>
-        <w:rPr>
-          <w:rFonts w:ascii="Times New Roman" w:hAnsi="Times New Roman" w:cs="Times New Roman"/>
-          <w:b/>
-          <w:bCs/>
-          <w:sz w:val="24"/>
-          <w:szCs w:val="24"/>
-        </w:rPr>
-      </w:pPr>
       <w:r>
         <w:rPr>
           <w:rFonts w:ascii="Times New Roman" w:hAnsi="Times New Roman" w:cs="Times New Roman"/>
@@ -1005,6 +1012,17 @@
           <w:szCs w:val="24"/>
         </w:rPr>
       </w:pPr>
+    </w:p>
+    <w:p>
+      <w:pPr>
+        <w:rPr>
+          <w:rFonts w:ascii="Times New Roman" w:hAnsi="Times New Roman" w:cs="Times New Roman"/>
+          <w:b/>
+          <w:bCs/>
+          <w:sz w:val="24"/>
+          <w:szCs w:val="24"/>
+        </w:rPr>
+      </w:pPr>
       <w:r>
         <w:rPr>
           <w:rFonts w:ascii="Times New Roman" w:hAnsi="Times New Roman" w:cs="Times New Roman"/>
@@ -1223,6 +1241,7 @@
           <w:szCs w:val="24"/>
         </w:rPr>
       </w:pPr>
+      <w:proofErr w:type="spellStart"/>
       <w:r>
         <w:rPr>
           <w:rFonts w:ascii="Times New Roman" w:hAnsi="Times New Roman" w:cs="Times New Roman"/>
@@ -1231,8 +1250,9 @@
           <w:sz w:val="24"/>
           <w:szCs w:val="24"/>
         </w:rPr>
-        <w:t>Modelling</w:t>
-      </w:r>
+        <w:t>Modeling</w:t>
+      </w:r>
+      <w:proofErr w:type="spellEnd"/>
     </w:p>
     <w:p>
       <w:pPr>
@@ -1555,24 +1575,20 @@
           <w:rFonts w:ascii="Times New Roman" w:hAnsi="Times New Roman" w:cs="Times New Roman"/>
           <w:b/>
           <w:bCs/>
-        </w:rPr>
-      </w:pPr>
-      <w:r>
-        <w:rPr>
-          <w:rFonts w:ascii="Times New Roman" w:hAnsi="Times New Roman" w:cs="Times New Roman"/>
-          <w:b/>
-          <w:bCs/>
+          <w:sz w:val="24"/>
+          <w:szCs w:val="24"/>
+        </w:rPr>
+      </w:pPr>
+      <w:r>
+        <w:rPr>
+          <w:rFonts w:ascii="Times New Roman" w:hAnsi="Times New Roman" w:cs="Times New Roman"/>
+          <w:b/>
+          <w:bCs/>
+          <w:sz w:val="24"/>
+          <w:szCs w:val="24"/>
         </w:rPr>
         <w:lastRenderedPageBreak/>
-        <w:t>High-Level</w:t>
-      </w:r>
-      <w:r>
-        <w:rPr>
-          <w:rFonts w:ascii="Times New Roman" w:hAnsi="Times New Roman" w:cs="Times New Roman"/>
-          <w:b/>
-          <w:bCs/>
-        </w:rPr>
-        <w:t xml:space="preserve"> Architecture Diagram </w:t>
+        <w:t xml:space="preserve">High-Level Architecture Diagram </w:t>
       </w:r>
     </w:p>
     <w:p>
@@ -1591,10 +1607,10 @@
           <w:noProof/>
         </w:rPr>
         <w:drawing>
-          <wp:inline distT="0" distB="0" distL="0" distR="0" wp14:anchorId="1BD9988A" wp14:editId="691E9D65">
-            <wp:extent cx="5731510" cy="5132705"/>
+          <wp:inline distT="0" distB="0" distL="0" distR="0" wp14:anchorId="5076EBE0" wp14:editId="3FE7B391">
+            <wp:extent cx="5731510" cy="3924300"/>
             <wp:effectExtent l="0" t="0" r="2540" b="0"/>
-            <wp:docPr id="870263777" name="Picture 2" descr="The diagram illustrates the process of fraud detection in the Central Bank of Ireland, starting with data ingestion and ending with the creation of business insights through various analytics tools.&#10;&#10;AI-generated content may be incorrect."/>
+            <wp:docPr id="1244422044" name="Picture 3" descr="The diagram illustrates the workflow for the Central Bank of Ireland's fraud detection process, detailing data ingestion, processing, modeling, analytics, and reporting.&#10;&#10;AI-generated content may be incorrect."/>
             <wp:cNvGraphicFramePr>
               <a:graphicFrameLocks xmlns:a="http://schemas.openxmlformats.org/drawingml/2006/main" noChangeAspect="1"/>
             </wp:cNvGraphicFramePr>
@@ -1602,7 +1618,7 @@
               <a:graphicData uri="http://schemas.openxmlformats.org/drawingml/2006/picture">
                 <pic:pic xmlns:pic="http://schemas.openxmlformats.org/drawingml/2006/picture">
                   <pic:nvPicPr>
-                    <pic:cNvPr id="870263777" name="Picture 2" descr="The diagram illustrates the process of fraud detection in the Central Bank of Ireland, starting with data ingestion and ending with the creation of business insights through various analytics tools.&#10;&#10;AI-generated content may be incorrect."/>
+                    <pic:cNvPr id="1244422044" name="Picture 3" descr="The diagram illustrates the workflow for the Central Bank of Ireland's fraud detection process, detailing data ingestion, processing, modeling, analytics, and reporting.&#10;&#10;AI-generated content may be incorrect."/>
                     <pic:cNvPicPr/>
                   </pic:nvPicPr>
                   <pic:blipFill>
@@ -1620,7 +1636,7 @@
                   <pic:spPr>
                     <a:xfrm>
                       <a:off x="0" y="0"/>
-                      <a:ext cx="5731510" cy="5132705"/>
+                      <a:ext cx="5731510" cy="3924300"/>
                     </a:xfrm>
                     <a:prstGeom prst="rect">
                       <a:avLst/>
@@ -1808,6 +1824,8 @@
       <w:pPr>
         <w:rPr>
           <w:rFonts w:ascii="Times New Roman" w:hAnsi="Times New Roman" w:cs="Times New Roman"/>
+          <w:sz w:val="24"/>
+          <w:szCs w:val="24"/>
           <w:lang w:val="en-US"/>
         </w:rPr>
       </w:pPr>
@@ -1816,28 +1834,11 @@
           <w:rFonts w:ascii="Times New Roman" w:hAnsi="Times New Roman" w:cs="Times New Roman"/>
           <w:b/>
           <w:bCs/>
+          <w:sz w:val="24"/>
+          <w:szCs w:val="24"/>
           <w:lang w:val="en-US"/>
         </w:rPr>
-        <w:lastRenderedPageBreak/>
-        <w:t>7.</w:t>
-      </w:r>
-      <w:r>
-        <w:rPr>
-          <w:rFonts w:ascii="Times New Roman" w:hAnsi="Times New Roman" w:cs="Times New Roman"/>
-          <w:b/>
-          <w:bCs/>
-          <w:lang w:val="en-US"/>
-        </w:rPr>
-        <w:t xml:space="preserve"> </w:t>
-      </w:r>
-      <w:r>
-        <w:rPr>
-          <w:rFonts w:ascii="Times New Roman" w:hAnsi="Times New Roman" w:cs="Times New Roman"/>
-          <w:b/>
-          <w:bCs/>
-          <w:lang w:val="en-US"/>
-        </w:rPr>
-        <w:t>Expected Deliverables</w:t>
+        <w:t>7. Expected Deliverables</w:t>
       </w:r>
     </w:p>
     <w:p>
@@ -1913,6 +1914,7 @@
           <w:rFonts w:ascii="Times New Roman" w:hAnsi="Times New Roman" w:cs="Times New Roman"/>
           <w:lang w:val="en-US"/>
         </w:rPr>
+        <w:lastRenderedPageBreak/>
         <w:t>Fraud</w:t>
       </w:r>
       <w:r>
@@ -2019,6 +2021,429 @@
         <w:t>AI Fluency Declaration</w:t>
       </w:r>
     </w:p>
+    <w:p>
+      <w:pPr>
+        <w:spacing w:line="256" w:lineRule="auto"/>
+      </w:pPr>
+      <w:r>
+        <w:rPr>
+          <w:rFonts w:ascii="Aptos" w:eastAsia="Aptos" w:hAnsi="Aptos" w:cs="Aptos"/>
+          <w:b/>
+          <w:bCs/>
+        </w:rPr>
+        <w:t>8.</w:t>
+      </w:r>
+      <w:r>
+        <w:rPr>
+          <w:rFonts w:ascii="Aptos" w:eastAsia="Aptos" w:hAnsi="Aptos" w:cs="Aptos"/>
+          <w:b/>
+          <w:bCs/>
+        </w:rPr>
+        <w:t xml:space="preserve"> </w:t>
+      </w:r>
+      <w:r>
+        <w:rPr>
+          <w:rFonts w:ascii="Aptos" w:eastAsia="Aptos" w:hAnsi="Aptos" w:cs="Aptos"/>
+          <w:b/>
+          <w:bCs/>
+        </w:rPr>
+        <w:t>Project Timeline (Gantt Chart)</w:t>
+      </w:r>
+    </w:p>
+    <w:p>
+      <w:pPr>
+        <w:pStyle w:val="ListParagraph"/>
+        <w:numPr>
+          <w:ilvl w:val="0"/>
+          <w:numId w:val="10"/>
+        </w:numPr>
+        <w:spacing w:line="256" w:lineRule="auto"/>
+      </w:pPr>
+      <w:r>
+        <w:rPr>
+          <w:rFonts w:ascii="Aptos" w:eastAsia="Aptos" w:hAnsi="Aptos" w:cs="Aptos"/>
+          <w:b/>
+          <w:bCs/>
+        </w:rPr>
+        <w:t>Semester 1</w:t>
+      </w:r>
+    </w:p>
+    <w:tbl>
+      <w:tblPr>
+        <w:tblW w:w="7144" w:type="dxa"/>
+        <w:tblBorders>
+          <w:top w:val="outset" w:sz="6" w:space="0" w:color="FFFFFF"/>
+          <w:left w:val="outset" w:sz="6" w:space="0" w:color="FFFFFF"/>
+          <w:bottom w:val="outset" w:sz="6" w:space="0" w:color="FFFFFF"/>
+          <w:right w:val="outset" w:sz="6" w:space="0" w:color="FFFFFF"/>
+        </w:tblBorders>
+        <w:tblLook w:val="04A0" w:firstRow="1" w:lastRow="0" w:firstColumn="1" w:lastColumn="0" w:noHBand="0" w:noVBand="1"/>
+      </w:tblPr>
+      <w:tblGrid>
+        <w:gridCol w:w="3421"/>
+        <w:gridCol w:w="3723"/>
+      </w:tblGrid>
+      <w:tr>
+        <w:trPr>
+          <w:trHeight w:val="671"/>
+        </w:trPr>
+        <w:tc>
+          <w:tcPr>
+            <w:tcW w:w="3421" w:type="dxa"/>
+            <w:tcBorders>
+              <w:top w:val="single" w:sz="6" w:space="0" w:color="E0E0E0"/>
+              <w:left w:val="single" w:sz="6" w:space="0" w:color="E0E0E0"/>
+              <w:bottom w:val="single" w:sz="6" w:space="0" w:color="E0E0E0"/>
+              <w:right w:val="single" w:sz="6" w:space="0" w:color="E0E0E0"/>
+            </w:tcBorders>
+            <w:tcMar>
+              <w:top w:w="15" w:type="dxa"/>
+              <w:left w:w="22" w:type="dxa"/>
+              <w:bottom w:w="15" w:type="dxa"/>
+              <w:right w:w="22" w:type="dxa"/>
+            </w:tcMar>
+            <w:hideMark/>
+          </w:tcPr>
+          <w:p>
+            <w:pPr>
+              <w:spacing w:line="256" w:lineRule="auto"/>
+              <w:rPr>
+                <w:color w:val="000000"/>
+              </w:rPr>
+            </w:pPr>
+            <w:r>
+              <w:rPr>
+                <w:b/>
+                <w:bCs/>
+                <w:color w:val="000000"/>
+              </w:rPr>
+              <w:t>1–2</w:t>
+            </w:r>
+          </w:p>
+        </w:tc>
+        <w:tc>
+          <w:tcPr>
+            <w:tcW w:w="3723" w:type="dxa"/>
+            <w:tcBorders>
+              <w:top w:val="single" w:sz="6" w:space="0" w:color="E0E0E0"/>
+              <w:left w:val="single" w:sz="6" w:space="0" w:color="E0E0E0"/>
+              <w:bottom w:val="single" w:sz="6" w:space="0" w:color="E0E0E0"/>
+              <w:right w:val="single" w:sz="6" w:space="0" w:color="E0E0E0"/>
+            </w:tcBorders>
+            <w:tcMar>
+              <w:top w:w="15" w:type="dxa"/>
+              <w:left w:w="22" w:type="dxa"/>
+              <w:bottom w:w="15" w:type="dxa"/>
+              <w:right w:w="22" w:type="dxa"/>
+            </w:tcMar>
+            <w:hideMark/>
+          </w:tcPr>
+          <w:p>
+            <w:pPr>
+              <w:rPr>
+                <w:color w:val="000000"/>
+                <w:sz w:val="24"/>
+                <w:szCs w:val="24"/>
+              </w:rPr>
+            </w:pPr>
+            <w:r>
+              <w:rPr>
+                <w:color w:val="000000"/>
+              </w:rPr>
+              <w:t>Topic selection, proposal writing</w:t>
+            </w:r>
+          </w:p>
+        </w:tc>
+      </w:tr>
+      <w:tr>
+        <w:trPr>
+          <w:trHeight w:val="671"/>
+        </w:trPr>
+        <w:tc>
+          <w:tcPr>
+            <w:tcW w:w="0" w:type="auto"/>
+            <w:tcBorders>
+              <w:top w:val="nil"/>
+              <w:left w:val="single" w:sz="6" w:space="0" w:color="E0E0E0"/>
+              <w:bottom w:val="single" w:sz="6" w:space="0" w:color="E0E0E0"/>
+              <w:right w:val="single" w:sz="6" w:space="0" w:color="E0E0E0"/>
+            </w:tcBorders>
+            <w:tcMar>
+              <w:top w:w="15" w:type="dxa"/>
+              <w:left w:w="22" w:type="dxa"/>
+              <w:bottom w:w="15" w:type="dxa"/>
+              <w:right w:w="22" w:type="dxa"/>
+            </w:tcMar>
+            <w:hideMark/>
+          </w:tcPr>
+          <w:p>
+            <w:pPr>
+              <w:spacing w:line="256" w:lineRule="auto"/>
+              <w:rPr>
+                <w:color w:val="000000"/>
+              </w:rPr>
+            </w:pPr>
+            <w:r>
+              <w:rPr>
+                <w:b/>
+                <w:bCs/>
+                <w:color w:val="000000"/>
+              </w:rPr>
+              <w:t>3–5</w:t>
+            </w:r>
+          </w:p>
+        </w:tc>
+        <w:tc>
+          <w:tcPr>
+            <w:tcW w:w="0" w:type="auto"/>
+            <w:tcBorders>
+              <w:top w:val="nil"/>
+              <w:left w:val="single" w:sz="6" w:space="0" w:color="E0E0E0"/>
+              <w:bottom w:val="single" w:sz="6" w:space="0" w:color="E0E0E0"/>
+              <w:right w:val="single" w:sz="6" w:space="0" w:color="E0E0E0"/>
+            </w:tcBorders>
+            <w:tcMar>
+              <w:top w:w="15" w:type="dxa"/>
+              <w:left w:w="22" w:type="dxa"/>
+              <w:bottom w:w="15" w:type="dxa"/>
+              <w:right w:w="22" w:type="dxa"/>
+            </w:tcMar>
+            <w:hideMark/>
+          </w:tcPr>
+          <w:p>
+            <w:pPr>
+              <w:rPr>
+                <w:color w:val="000000"/>
+                <w:sz w:val="24"/>
+                <w:szCs w:val="24"/>
+              </w:rPr>
+            </w:pPr>
+            <w:r>
+              <w:rPr>
+                <w:color w:val="000000"/>
+              </w:rPr>
+              <w:t>Data collection &amp; merging</w:t>
+            </w:r>
+          </w:p>
+        </w:tc>
+      </w:tr>
+      <w:tr>
+        <w:trPr>
+          <w:trHeight w:val="671"/>
+        </w:trPr>
+        <w:tc>
+          <w:tcPr>
+            <w:tcW w:w="0" w:type="auto"/>
+            <w:tcBorders>
+              <w:top w:val="nil"/>
+              <w:left w:val="single" w:sz="6" w:space="0" w:color="E0E0E0"/>
+              <w:bottom w:val="single" w:sz="6" w:space="0" w:color="E0E0E0"/>
+              <w:right w:val="single" w:sz="6" w:space="0" w:color="E0E0E0"/>
+            </w:tcBorders>
+            <w:tcMar>
+              <w:top w:w="15" w:type="dxa"/>
+              <w:left w:w="22" w:type="dxa"/>
+              <w:bottom w:w="15" w:type="dxa"/>
+              <w:right w:w="22" w:type="dxa"/>
+            </w:tcMar>
+            <w:hideMark/>
+          </w:tcPr>
+          <w:p>
+            <w:pPr>
+              <w:spacing w:line="256" w:lineRule="auto"/>
+              <w:rPr>
+                <w:color w:val="000000"/>
+              </w:rPr>
+            </w:pPr>
+            <w:r>
+              <w:rPr>
+                <w:b/>
+                <w:bCs/>
+                <w:color w:val="000000"/>
+              </w:rPr>
+              <w:t>6–8</w:t>
+            </w:r>
+          </w:p>
+        </w:tc>
+        <w:tc>
+          <w:tcPr>
+            <w:tcW w:w="0" w:type="auto"/>
+            <w:tcBorders>
+              <w:top w:val="nil"/>
+              <w:left w:val="single" w:sz="6" w:space="0" w:color="E0E0E0"/>
+              <w:bottom w:val="single" w:sz="6" w:space="0" w:color="E0E0E0"/>
+              <w:right w:val="single" w:sz="6" w:space="0" w:color="E0E0E0"/>
+            </w:tcBorders>
+            <w:tcMar>
+              <w:top w:w="15" w:type="dxa"/>
+              <w:left w:w="22" w:type="dxa"/>
+              <w:bottom w:w="15" w:type="dxa"/>
+              <w:right w:w="22" w:type="dxa"/>
+            </w:tcMar>
+            <w:hideMark/>
+          </w:tcPr>
+          <w:p>
+            <w:pPr>
+              <w:rPr>
+                <w:color w:val="000000"/>
+                <w:sz w:val="24"/>
+                <w:szCs w:val="24"/>
+              </w:rPr>
+            </w:pPr>
+            <w:r>
+              <w:rPr>
+                <w:color w:val="000000"/>
+              </w:rPr>
+              <w:t>EDA &amp; feature engineering</w:t>
+            </w:r>
+          </w:p>
+        </w:tc>
+      </w:tr>
+      <w:tr>
+        <w:trPr>
+          <w:trHeight w:val="671"/>
+        </w:trPr>
+        <w:tc>
+          <w:tcPr>
+            <w:tcW w:w="0" w:type="auto"/>
+            <w:tcBorders>
+              <w:top w:val="nil"/>
+              <w:left w:val="single" w:sz="6" w:space="0" w:color="E0E0E0"/>
+              <w:bottom w:val="single" w:sz="6" w:space="0" w:color="E0E0E0"/>
+              <w:right w:val="single" w:sz="6" w:space="0" w:color="E0E0E0"/>
+            </w:tcBorders>
+            <w:tcMar>
+              <w:top w:w="15" w:type="dxa"/>
+              <w:left w:w="22" w:type="dxa"/>
+              <w:bottom w:w="15" w:type="dxa"/>
+              <w:right w:w="22" w:type="dxa"/>
+            </w:tcMar>
+            <w:hideMark/>
+          </w:tcPr>
+          <w:p>
+            <w:pPr>
+              <w:spacing w:line="256" w:lineRule="auto"/>
+              <w:rPr>
+                <w:color w:val="000000"/>
+              </w:rPr>
+            </w:pPr>
+            <w:r>
+              <w:rPr>
+                <w:b/>
+                <w:bCs/>
+                <w:color w:val="000000"/>
+              </w:rPr>
+              <w:t>9–11</w:t>
+            </w:r>
+          </w:p>
+        </w:tc>
+        <w:tc>
+          <w:tcPr>
+            <w:tcW w:w="0" w:type="auto"/>
+            <w:tcBorders>
+              <w:top w:val="nil"/>
+              <w:left w:val="single" w:sz="6" w:space="0" w:color="E0E0E0"/>
+              <w:bottom w:val="single" w:sz="6" w:space="0" w:color="E0E0E0"/>
+              <w:right w:val="single" w:sz="6" w:space="0" w:color="E0E0E0"/>
+            </w:tcBorders>
+            <w:tcMar>
+              <w:top w:w="15" w:type="dxa"/>
+              <w:left w:w="22" w:type="dxa"/>
+              <w:bottom w:w="15" w:type="dxa"/>
+              <w:right w:w="22" w:type="dxa"/>
+            </w:tcMar>
+            <w:hideMark/>
+          </w:tcPr>
+          <w:p>
+            <w:pPr>
+              <w:rPr>
+                <w:color w:val="000000"/>
+                <w:sz w:val="24"/>
+                <w:szCs w:val="24"/>
+              </w:rPr>
+            </w:pPr>
+            <w:r>
+              <w:rPr>
+                <w:color w:val="000000"/>
+              </w:rPr>
+              <w:t>Initial modelling</w:t>
+            </w:r>
+          </w:p>
+        </w:tc>
+      </w:tr>
+      <w:tr>
+        <w:trPr>
+          <w:trHeight w:val="671"/>
+        </w:trPr>
+        <w:tc>
+          <w:tcPr>
+            <w:tcW w:w="0" w:type="auto"/>
+            <w:tcBorders>
+              <w:top w:val="nil"/>
+              <w:left w:val="single" w:sz="6" w:space="0" w:color="E0E0E0"/>
+              <w:bottom w:val="single" w:sz="6" w:space="0" w:color="E0E0E0"/>
+              <w:right w:val="single" w:sz="6" w:space="0" w:color="E0E0E0"/>
+            </w:tcBorders>
+            <w:tcMar>
+              <w:top w:w="15" w:type="dxa"/>
+              <w:left w:w="22" w:type="dxa"/>
+              <w:bottom w:w="15" w:type="dxa"/>
+              <w:right w:w="22" w:type="dxa"/>
+            </w:tcMar>
+            <w:hideMark/>
+          </w:tcPr>
+          <w:p>
+            <w:pPr>
+              <w:spacing w:line="256" w:lineRule="auto"/>
+              <w:rPr>
+                <w:color w:val="000000"/>
+              </w:rPr>
+            </w:pPr>
+            <w:r>
+              <w:rPr>
+                <w:b/>
+                <w:bCs/>
+                <w:color w:val="000000"/>
+              </w:rPr>
+              <w:t>12–13</w:t>
+            </w:r>
+          </w:p>
+        </w:tc>
+        <w:tc>
+          <w:tcPr>
+            <w:tcW w:w="0" w:type="auto"/>
+            <w:tcBorders>
+              <w:top w:val="nil"/>
+              <w:left w:val="single" w:sz="6" w:space="0" w:color="E0E0E0"/>
+              <w:bottom w:val="single" w:sz="6" w:space="0" w:color="E0E0E0"/>
+              <w:right w:val="single" w:sz="6" w:space="0" w:color="E0E0E0"/>
+            </w:tcBorders>
+            <w:tcMar>
+              <w:top w:w="15" w:type="dxa"/>
+              <w:left w:w="22" w:type="dxa"/>
+              <w:bottom w:w="15" w:type="dxa"/>
+              <w:right w:w="22" w:type="dxa"/>
+            </w:tcMar>
+            <w:hideMark/>
+          </w:tcPr>
+          <w:p>
+            <w:pPr>
+              <w:rPr>
+                <w:color w:val="000000"/>
+                <w:sz w:val="24"/>
+                <w:szCs w:val="24"/>
+              </w:rPr>
+            </w:pPr>
+            <w:r>
+              <w:rPr>
+                <w:color w:val="000000"/>
+              </w:rPr>
+              <w:t>Interim report submission</w:t>
+            </w:r>
+          </w:p>
+        </w:tc>
+      </w:tr>
+    </w:tbl>
     <w:p>
       <w:pPr>
         <w:rPr>
@@ -3431,15 +3856,6 @@
   </w:num>
   <w:num w:numId="10" w16cid:durableId="1190606424">
     <w:abstractNumId w:val="0"/>
-    <w:lvlOverride w:ilvl="0"/>
-    <w:lvlOverride w:ilvl="1"/>
-    <w:lvlOverride w:ilvl="2"/>
-    <w:lvlOverride w:ilvl="3"/>
-    <w:lvlOverride w:ilvl="4"/>
-    <w:lvlOverride w:ilvl="5"/>
-    <w:lvlOverride w:ilvl="6"/>
-    <w:lvlOverride w:ilvl="7"/>
-    <w:lvlOverride w:ilvl="8"/>
   </w:num>
 </w:numbering>
 </file>
@@ -4047,6 +4463,7 @@
   <w:style w:type="character" w:default="1" w:styleId="DefaultParagraphFont">
     <w:name w:val="Default Paragraph Font"/>
     <w:uiPriority w:val="1"/>
+    <w:semiHidden/>
     <w:unhideWhenUsed/>
   </w:style>
   <w:style w:type="table" w:default="1" w:styleId="TableNormal">

</xml_diff>